<commit_message>
cap nhat mau dang ky
</commit_message>
<xml_diff>
--- a/webGLCv2/wwwroot/downloads/Mau-dang-ky-dich-vu-E-Warehouse-GLC-ca-nhan.docx
+++ b/webGLCv2/wwwroot/downloads/Mau-dang-ky-dich-vu-E-Warehouse-GLC-ca-nhan.docx
@@ -1,10 +1,15 @@
 
 <file path=word/document.xml><?xml version="1.0" encoding="utf-8"?>
-<w:document xmlns:wpc="http://schemas.microsoft.com/office/word/2010/wordprocessingCanvas" xmlns:cx="http://schemas.microsoft.com/office/drawing/2014/chartex" xmlns:cx1="http://schemas.microsoft.com/office/drawing/2015/9/8/chartex" xmlns:cx2="http://schemas.microsoft.com/office/drawing/2015/10/21/chartex" xmlns:cx3="http://schemas.microsoft.com/office/drawing/2016/5/9/chartex" xmlns:cx4="http://schemas.microsoft.com/office/drawing/2016/5/10/chartex" xmlns:cx5="http://schemas.microsoft.com/office/drawing/2016/5/11/chartex" xmlns:cx6="http://schemas.microsoft.com/office/drawing/2016/5/12/chartex" xmlns:cx7="http://schemas.microsoft.com/office/drawing/2016/5/13/chartex" xmlns:cx8="http://schemas.microsoft.com/office/drawing/2016/5/14/chartex" xmlns:mc="http://schemas.openxmlformats.org/markup-compatibility/2006" xmlns:aink="http://schemas.microsoft.com/office/drawing/2016/ink" xmlns:am3d="http://schemas.microsoft.com/office/drawing/2017/model3d" xmlns:o="urn:schemas-microsoft-com:office:office" xmlns:oel="http://schemas.microsoft.com/office/2019/extlst" xmlns:r="http://schemas.openxmlformats.org/officeDocument/2006/relationships" xmlns:m="http://schemas.openxmlformats.org/officeDocument/2006/math" xmlns:v="urn:schemas-microsoft-com:vml" xmlns:wp14="http://schemas.microsoft.com/office/word/2010/wordprocessingDrawing" xmlns:wp="http://schemas.openxmlformats.org/drawingml/2006/wordprocessingDrawing" xmlns:w10="urn:schemas-microsoft-com:office:word" xmlns:w="http://schemas.openxmlformats.org/wordprocessingml/2006/main" xmlns:w14="http://schemas.microsoft.com/office/word/2010/wordml" xmlns:w15="http://schemas.microsoft.com/office/word/2012/wordml" xmlns:w16cex="http://schemas.microsoft.com/office/word/2018/wordml/cex" xmlns:w16cid="http://schemas.microsoft.com/office/word/2016/wordml/cid" xmlns:w16="http://schemas.microsoft.com/office/word/2018/wordml" xmlns:w16sdtdh="http://schemas.microsoft.com/office/word/2020/wordml/sdtdatahash" xmlns:w16se="http://schemas.microsoft.com/office/word/2015/wordml/symex" xmlns:wpg="http://schemas.microsoft.com/office/word/2010/wordprocessingGroup" xmlns:wpi="http://schemas.microsoft.com/office/word/2010/wordprocessingInk" xmlns:wne="http://schemas.microsoft.com/office/word/2006/wordml" xmlns:wps="http://schemas.microsoft.com/office/word/2010/wordprocessingShape" mc:Ignorable="w14 w15 w16se w16cid w16 w16cex w16sdtdh wp14">
+<w:document xmlns:wpc="http://schemas.microsoft.com/office/word/2010/wordprocessingCanvas" xmlns:cx="http://schemas.microsoft.com/office/drawing/2014/chartex" xmlns:cx1="http://schemas.microsoft.com/office/drawing/2015/9/8/chartex" xmlns:cx2="http://schemas.microsoft.com/office/drawing/2015/10/21/chartex" xmlns:cx3="http://schemas.microsoft.com/office/drawing/2016/5/9/chartex" xmlns:cx4="http://schemas.microsoft.com/office/drawing/2016/5/10/chartex" xmlns:cx5="http://schemas.microsoft.com/office/drawing/2016/5/11/chartex" xmlns:cx6="http://schemas.microsoft.com/office/drawing/2016/5/12/chartex" xmlns:cx7="http://schemas.microsoft.com/office/drawing/2016/5/13/chartex" xmlns:cx8="http://schemas.microsoft.com/office/drawing/2016/5/14/chartex" xmlns:mc="http://schemas.openxmlformats.org/markup-compatibility/2006" xmlns:aink="http://schemas.microsoft.com/office/drawing/2016/ink" xmlns:am3d="http://schemas.microsoft.com/office/drawing/2017/model3d" xmlns:o="urn:schemas-microsoft-com:office:office" xmlns:oel="http://schemas.microsoft.com/office/2019/extlst" xmlns:r="http://schemas.openxmlformats.org/officeDocument/2006/relationships" xmlns:m="http://schemas.openxmlformats.org/officeDocument/2006/math" xmlns:v="urn:schemas-microsoft-com:vml" xmlns:wp14="http://schemas.microsoft.com/office/word/2010/wordprocessingDrawing" xmlns:wp="http://schemas.openxmlformats.org/drawingml/2006/wordprocessingDrawing" xmlns:w10="urn:schemas-microsoft-com:office:word" xmlns:w="http://schemas.openxmlformats.org/wordprocessingml/2006/main" xmlns:w14="http://schemas.microsoft.com/office/word/2010/wordml" xmlns:w15="http://schemas.microsoft.com/office/word/2012/wordml" xmlns:w16cex="http://schemas.microsoft.com/office/word/2018/wordml/cex" xmlns:w16cid="http://schemas.microsoft.com/office/word/2016/wordml/cid" xmlns:w16="http://schemas.microsoft.com/office/word/2018/wordml" xmlns:w16du="http://schemas.microsoft.com/office/word/2023/wordml/word16du" xmlns:w16sdtdh="http://schemas.microsoft.com/office/word/2020/wordml/sdtdatahash" xmlns:w16sdtfl="http://schemas.microsoft.com/office/word/2024/wordml/sdtformatlock" xmlns:w16se="http://schemas.microsoft.com/office/word/2015/wordml/symex" xmlns:wpg="http://schemas.microsoft.com/office/word/2010/wordprocessingGroup" xmlns:wpi="http://schemas.microsoft.com/office/word/2010/wordprocessingInk" xmlns:wne="http://schemas.microsoft.com/office/word/2006/wordml" xmlns:wps="http://schemas.microsoft.com/office/word/2010/wordprocessingShape" mc:Ignorable="w14 w15 w16se w16cid w16 w16cex w16sdtdh w16sdtfl w16du wp14">
   <w:body>
     <w:p>
       <w:pPr>
+        <w:spacing w:after="300" w:line="240" w:lineRule="auto"/>
         <w:jc w:val="center"/>
+        <w:rPr>
+          <w:b/>
+          <w:sz w:val="32"/>
+        </w:rPr>
       </w:pPr>
       <w:r>
         <w:rPr>
@@ -23,28 +28,26 @@
       </w:r>
     </w:p>
     <w:p>
+      <w:pPr>
+        <w:spacing w:after="300" w:line="240" w:lineRule="auto"/>
+        <w:jc w:val="center"/>
+      </w:pPr>
+    </w:p>
+    <w:p>
+      <w:pPr>
+        <w:spacing w:after="300" w:line="240" w:lineRule="auto"/>
+      </w:pPr>
       <w:r>
         <w:rPr>
           <w:b/>
         </w:rPr>
-        <w:t xml:space="preserve">KÍNH </w:t>
-      </w:r>
-      <w:proofErr w:type="gramStart"/>
-      <w:r>
-        <w:rPr>
-          <w:b/>
-        </w:rPr>
-        <w:t>GỬI :</w:t>
-      </w:r>
-      <w:proofErr w:type="gramEnd"/>
-      <w:r>
-        <w:rPr>
-          <w:b/>
-        </w:rPr>
-        <w:t xml:space="preserve"> CÔNG TY TNHH MTV TRUNG TÂM LOGISTICS XANH</w:t>
+        <w:t>KÍNH GỬI : CÔNG TY TNHH MTV TRUNG TÂM LOGISTICS XANH</w:t>
       </w:r>
     </w:p>
     <w:p>
+      <w:pPr>
+        <w:spacing w:after="300" w:line="240" w:lineRule="auto"/>
+      </w:pPr>
       <w:r>
         <w:rPr>
           <w:b/>
@@ -56,6 +59,9 @@
       </w:r>
     </w:p>
     <w:p>
+      <w:pPr>
+        <w:spacing w:after="300" w:line="240" w:lineRule="auto"/>
+      </w:pPr>
       <w:r>
         <w:rPr>
           <w:b/>
@@ -67,6 +73,9 @@
       </w:r>
     </w:p>
     <w:p>
+      <w:pPr>
+        <w:spacing w:after="300" w:line="240" w:lineRule="auto"/>
+      </w:pPr>
       <w:r>
         <w:rPr>
           <w:b/>
@@ -78,6 +87,9 @@
       </w:r>
     </w:p>
     <w:p>
+      <w:pPr>
+        <w:spacing w:after="300" w:line="240" w:lineRule="auto"/>
+      </w:pPr>
       <w:r>
         <w:rPr>
           <w:b/>
@@ -89,6 +101,9 @@
       </w:r>
     </w:p>
     <w:p>
+      <w:pPr>
+        <w:spacing w:after="300" w:line="240" w:lineRule="auto"/>
+      </w:pPr>
       <w:r>
         <w:rPr>
           <w:b/>
@@ -100,6 +115,9 @@
       </w:r>
     </w:p>
     <w:p>
+      <w:pPr>
+        <w:spacing w:after="300" w:line="240" w:lineRule="auto"/>
+      </w:pPr>
       <w:r>
         <w:rPr>
           <w:b/>
@@ -111,6 +129,9 @@
       </w:r>
     </w:p>
     <w:p>
+      <w:pPr>
+        <w:spacing w:after="300" w:line="240" w:lineRule="auto"/>
+      </w:pPr>
       <w:r>
         <w:rPr>
           <w:b/>
@@ -122,6 +143,9 @@
       </w:r>
     </w:p>
     <w:p>
+      <w:pPr>
+        <w:spacing w:after="300" w:line="240" w:lineRule="auto"/>
+      </w:pPr>
       <w:r>
         <w:rPr>
           <w:b/>
@@ -133,66 +157,61 @@
       </w:r>
     </w:p>
     <w:p>
+      <w:pPr>
+        <w:spacing w:after="300" w:line="240" w:lineRule="auto"/>
+      </w:pPr>
       <w:r>
         <w:rPr>
           <w:b/>
         </w:rPr>
-        <w:t xml:space="preserve">Cam </w:t>
-      </w:r>
-      <w:proofErr w:type="spellStart"/>
-      <w:r>
-        <w:rPr>
-          <w:b/>
-        </w:rPr>
-        <w:t>kết</w:t>
-      </w:r>
-      <w:proofErr w:type="spellEnd"/>
-      <w:r>
-        <w:rPr>
-          <w:b/>
-        </w:rPr>
-        <w:t xml:space="preserve"> </w:t>
-      </w:r>
-      <w:proofErr w:type="spellStart"/>
-      <w:r>
-        <w:rPr>
-          <w:b/>
-        </w:rPr>
-        <w:t>của</w:t>
-      </w:r>
-      <w:proofErr w:type="spellEnd"/>
-      <w:r>
-        <w:rPr>
-          <w:b/>
-        </w:rPr>
-        <w:t xml:space="preserve"> </w:t>
-      </w:r>
-      <w:proofErr w:type="spellStart"/>
-      <w:r>
-        <w:rPr>
-          <w:b/>
-        </w:rPr>
-        <w:t>khách</w:t>
-      </w:r>
-      <w:proofErr w:type="spellEnd"/>
-      <w:r>
-        <w:rPr>
-          <w:b/>
-        </w:rPr>
-        <w:t xml:space="preserve"> hàng</w:t>
+        <w:t>Cam kết của khách hàng</w:t>
       </w:r>
     </w:p>
     <w:p>
       <w:pPr>
+        <w:spacing w:after="300" w:line="240" w:lineRule="auto"/>
         <w:jc w:val="both"/>
       </w:pPr>
       <w:r>
         <w:t>1. Các thông tin đăng ký là đầy đủ, trung thực và chính xác. Tôi hoàn toàn chịu trách nhiệm về các thông tin đã cung cấp.</w:t>
       </w:r>
     </w:p>
+    <w:p>
+      <w:pPr>
+        <w:spacing w:after="300" w:line="240" w:lineRule="auto"/>
+        <w:jc w:val="both"/>
+      </w:pPr>
+      <w:r>
+        <w:t>2. Tôi đã đọc, hiểu và đồng ý tuân thủ các điều kiện, quy định sử dụng dịch vụ E-Warehouse do GLC ban hành.</w:t>
+      </w:r>
+    </w:p>
+    <w:p>
+      <w:pPr>
+        <w:spacing w:after="300" w:line="240" w:lineRule="auto"/>
+        <w:jc w:val="both"/>
+      </w:pPr>
+      <w:r>
+        <w:t>3. Tôi có trách nhiệm bảo mật tài khoản, mật khẩu và mã OTP trong quá trình sử dụng dịch vụ.</w:t>
+      </w:r>
+    </w:p>
+    <w:p>
+      <w:pPr>
+        <w:spacing w:after="300" w:line="240" w:lineRule="auto"/>
+        <w:jc w:val="both"/>
+      </w:pPr>
+      <w:r>
+        <w:t>4. Tôi đồng ý sử dụng hóa đơn điện tử, thông báo điện tử và các giao dịch điện tử phát sinh trên hệ thống E-Warehouse</w:t>
+      </w:r>
+      <w:r>
+        <w:t xml:space="preserve">; </w:t>
+      </w:r>
+      <w:r>
+        <w:t>đồng thời phối hợp thực hiện việc điều chỉnh, thay thế hoặc hủy hóa đơn điện tử theo quy định của pháp luật thuế khi có yêu cầu.</w:t>
+      </w:r>
+    </w:p>
     <w:tbl>
       <w:tblPr>
-        <w:tblpPr w:leftFromText="180" w:rightFromText="180" w:vertAnchor="text" w:horzAnchor="page" w:tblpX="2443" w:tblpY="2694"/>
+        <w:tblpPr w:leftFromText="180" w:rightFromText="180" w:vertAnchor="text" w:horzAnchor="margin" w:tblpXSpec="right" w:tblpY="327"/>
         <w:tblW w:w="8640" w:type="dxa"/>
         <w:tblLook w:val="04A0" w:firstRow="1" w:lastRow="0" w:firstColumn="1" w:lastColumn="0" w:noHBand="0" w:noVBand="1"/>
       </w:tblPr>
@@ -207,6 +226,7 @@
           </w:tcPr>
           <w:p>
             <w:pPr>
+              <w:spacing w:after="120" w:line="240" w:lineRule="auto"/>
               <w:jc w:val="center"/>
             </w:pPr>
             <w:r>
@@ -229,6 +249,7 @@
           </w:tcPr>
           <w:p>
             <w:pPr>
+              <w:spacing w:after="120" w:line="240" w:lineRule="auto"/>
               <w:jc w:val="center"/>
               <w:rPr>
                 <w:b/>
@@ -239,74 +260,13 @@
                 <w:b/>
               </w:rPr>
               <w:br/>
-            </w:r>
-            <w:r>
-              <w:rPr>
-                <w:b/>
-              </w:rPr>
-              <w:t>…</w:t>
-            </w:r>
-            <w:r>
-              <w:rPr>
-                <w:b/>
-              </w:rPr>
-              <w:t xml:space="preserve">………, </w:t>
-            </w:r>
-            <w:proofErr w:type="spellStart"/>
-            <w:r>
-              <w:rPr>
-                <w:b/>
-              </w:rPr>
-              <w:t>ngày</w:t>
-            </w:r>
-            <w:proofErr w:type="spellEnd"/>
-            <w:r>
-              <w:rPr>
-                <w:b/>
-              </w:rPr>
-              <w:t xml:space="preserve"> … </w:t>
-            </w:r>
-            <w:proofErr w:type="spellStart"/>
-            <w:r>
-              <w:rPr>
-                <w:b/>
-              </w:rPr>
-              <w:t>tháng</w:t>
-            </w:r>
-            <w:proofErr w:type="spellEnd"/>
-            <w:r>
-              <w:rPr>
-                <w:b/>
-              </w:rPr>
-              <w:t xml:space="preserve"> … </w:t>
-            </w:r>
-            <w:proofErr w:type="spellStart"/>
-            <w:r>
-              <w:rPr>
-                <w:b/>
-              </w:rPr>
-              <w:t>năm</w:t>
-            </w:r>
-            <w:proofErr w:type="spellEnd"/>
-            <w:r>
-              <w:rPr>
-                <w:b/>
-              </w:rPr>
-              <w:t xml:space="preserve"> </w:t>
-            </w:r>
-            <w:r>
-              <w:rPr>
-                <w:b/>
-              </w:rPr>
-              <w:t>…</w:t>
+              <w:t>…………, ngày … tháng … năm …</w:t>
             </w:r>
           </w:p>
           <w:p>
             <w:pPr>
+              <w:spacing w:after="120" w:line="240" w:lineRule="auto"/>
               <w:jc w:val="center"/>
-              <w:rPr>
-                <w:b/>
-              </w:rPr>
             </w:pPr>
             <w:r>
               <w:rPr>
@@ -320,101 +280,13 @@
               </w:rPr>
               <w:br/>
             </w:r>
-          </w:p>
-          <w:p>
-            <w:pPr>
-              <w:jc w:val="center"/>
-            </w:pPr>
             <w:r>
               <w:rPr>
                 <w:b/>
+                <w:i/>
+                <w:iCs/>
               </w:rPr>
-              <w:br/>
-              <w:t>(</w:t>
-            </w:r>
-            <w:proofErr w:type="spellStart"/>
-            <w:r>
-              <w:rPr>
-                <w:b/>
-              </w:rPr>
-              <w:t>Ký</w:t>
-            </w:r>
-            <w:proofErr w:type="spellEnd"/>
-            <w:r>
-              <w:rPr>
-                <w:b/>
-              </w:rPr>
-              <w:t xml:space="preserve"> </w:t>
-            </w:r>
-            <w:proofErr w:type="spellStart"/>
-            <w:r>
-              <w:rPr>
-                <w:b/>
-              </w:rPr>
-              <w:t>và</w:t>
-            </w:r>
-            <w:proofErr w:type="spellEnd"/>
-            <w:r>
-              <w:rPr>
-                <w:b/>
-              </w:rPr>
-              <w:t xml:space="preserve"> </w:t>
-            </w:r>
-            <w:proofErr w:type="spellStart"/>
-            <w:r>
-              <w:rPr>
-                <w:b/>
-              </w:rPr>
-              <w:t>ghi</w:t>
-            </w:r>
-            <w:proofErr w:type="spellEnd"/>
-            <w:r>
-              <w:rPr>
-                <w:b/>
-              </w:rPr>
-              <w:t xml:space="preserve"> </w:t>
-            </w:r>
-            <w:proofErr w:type="spellStart"/>
-            <w:r>
-              <w:rPr>
-                <w:b/>
-              </w:rPr>
-              <w:t>rõ</w:t>
-            </w:r>
-            <w:proofErr w:type="spellEnd"/>
-            <w:r>
-              <w:rPr>
-                <w:b/>
-              </w:rPr>
-              <w:t xml:space="preserve"> </w:t>
-            </w:r>
-            <w:proofErr w:type="spellStart"/>
-            <w:r>
-              <w:rPr>
-                <w:b/>
-              </w:rPr>
-              <w:t>họ</w:t>
-            </w:r>
-            <w:proofErr w:type="spellEnd"/>
-            <w:r>
-              <w:rPr>
-                <w:b/>
-              </w:rPr>
-              <w:t xml:space="preserve"> </w:t>
-            </w:r>
-            <w:proofErr w:type="spellStart"/>
-            <w:r>
-              <w:rPr>
-                <w:b/>
-              </w:rPr>
-              <w:t>tên</w:t>
-            </w:r>
-            <w:proofErr w:type="spellEnd"/>
-            <w:r>
-              <w:rPr>
-                <w:b/>
-              </w:rPr>
-              <w:t>)</w:t>
+              <w:t>(Ký và ghi rõ họ tên)</w:t>
             </w:r>
           </w:p>
         </w:tc>
@@ -422,55 +294,13 @@
     </w:tbl>
     <w:p>
       <w:pPr>
+        <w:spacing w:after="120" w:line="240" w:lineRule="auto"/>
         <w:jc w:val="both"/>
       </w:pPr>
-      <w:r>
-        <w:t>2. Tôi đã đọc, hiểu và đồng ý tuân thủ các điều kiện, quy định sử dụng dịch vụ E-Warehouse do GLC ban hành.</w:t>
-      </w:r>
-    </w:p>
-    <w:p>
-      <w:pPr>
-        <w:jc w:val="both"/>
-      </w:pPr>
-      <w:r>
-        <w:t>3. Tôi có trách nhiệm bảo mật tài khoản, mật khẩu và mã OTP trong quá trình sử dụng dịch vụ.</w:t>
-      </w:r>
-    </w:p>
-    <w:p>
-      <w:pPr>
-        <w:jc w:val="both"/>
-      </w:pPr>
-      <w:r>
-        <w:t xml:space="preserve">4. Tôi đồng ý sử dụng hóa đơn điện tử, thông báo điện tử và các giao dịch điện tử phát sinh </w:t>
-      </w:r>
-      <w:proofErr w:type="spellStart"/>
-      <w:r>
-        <w:t>trên</w:t>
-      </w:r>
-      <w:proofErr w:type="spellEnd"/>
-      <w:r>
-        <w:t xml:space="preserve"> </w:t>
-      </w:r>
-      <w:proofErr w:type="spellStart"/>
-      <w:r>
-        <w:t>hệ</w:t>
-      </w:r>
-      <w:proofErr w:type="spellEnd"/>
-      <w:r>
-        <w:t xml:space="preserve"> </w:t>
-      </w:r>
-      <w:proofErr w:type="spellStart"/>
-      <w:r>
-        <w:t>thống</w:t>
-      </w:r>
-      <w:proofErr w:type="spellEnd"/>
-      <w:r>
-        <w:t xml:space="preserve"> E-Warehouse.</w:t>
-      </w:r>
     </w:p>
     <w:sectPr>
-      <w:pgSz w:w="12240" w:h="15840"/>
-      <w:pgMar w:top="1440" w:right="1800" w:bottom="1440" w:left="1800" w:header="720" w:footer="720" w:gutter="0"/>
+      <w:pgSz w:w="11906" w:h="16838" w:code="9"/>
+      <w:pgMar w:top="1134" w:right="851" w:bottom="1134" w:left="1797" w:header="720" w:footer="720" w:gutter="0"/>
       <w:cols w:space="720"/>
       <w:docGrid w:linePitch="360"/>
     </w:sectPr>
@@ -479,7 +309,7 @@
 </file>
 
 <file path=word/endnotes.xml><?xml version="1.0" encoding="utf-8"?>
-<w:endnotes xmlns:wpc="http://schemas.microsoft.com/office/word/2010/wordprocessingCanvas" xmlns:cx="http://schemas.microsoft.com/office/drawing/2014/chartex" xmlns:cx1="http://schemas.microsoft.com/office/drawing/2015/9/8/chartex" xmlns:cx2="http://schemas.microsoft.com/office/drawing/2015/10/21/chartex" xmlns:cx3="http://schemas.microsoft.com/office/drawing/2016/5/9/chartex" xmlns:cx4="http://schemas.microsoft.com/office/drawing/2016/5/10/chartex" xmlns:cx5="http://schemas.microsoft.com/office/drawing/2016/5/11/chartex" xmlns:cx6="http://schemas.microsoft.com/office/drawing/2016/5/12/chartex" xmlns:cx7="http://schemas.microsoft.com/office/drawing/2016/5/13/chartex" xmlns:cx8="http://schemas.microsoft.com/office/drawing/2016/5/14/chartex" xmlns:mc="http://schemas.openxmlformats.org/markup-compatibility/2006" xmlns:aink="http://schemas.microsoft.com/office/drawing/2016/ink" xmlns:am3d="http://schemas.microsoft.com/office/drawing/2017/model3d" xmlns:o="urn:schemas-microsoft-com:office:office" xmlns:oel="http://schemas.microsoft.com/office/2019/extlst" xmlns:r="http://schemas.openxmlformats.org/officeDocument/2006/relationships" xmlns:m="http://schemas.openxmlformats.org/officeDocument/2006/math" xmlns:v="urn:schemas-microsoft-com:vml" xmlns:wp14="http://schemas.microsoft.com/office/word/2010/wordprocessingDrawing" xmlns:wp="http://schemas.openxmlformats.org/drawingml/2006/wordprocessingDrawing" xmlns:w10="urn:schemas-microsoft-com:office:word" xmlns:w="http://schemas.openxmlformats.org/wordprocessingml/2006/main" xmlns:w14="http://schemas.microsoft.com/office/word/2010/wordml" xmlns:w15="http://schemas.microsoft.com/office/word/2012/wordml" xmlns:w16cex="http://schemas.microsoft.com/office/word/2018/wordml/cex" xmlns:w16cid="http://schemas.microsoft.com/office/word/2016/wordml/cid" xmlns:w16="http://schemas.microsoft.com/office/word/2018/wordml" xmlns:w16sdtdh="http://schemas.microsoft.com/office/word/2020/wordml/sdtdatahash" xmlns:w16se="http://schemas.microsoft.com/office/word/2015/wordml/symex" xmlns:wpg="http://schemas.microsoft.com/office/word/2010/wordprocessingGroup" xmlns:wpi="http://schemas.microsoft.com/office/word/2010/wordprocessingInk" xmlns:wne="http://schemas.microsoft.com/office/word/2006/wordml" xmlns:wps="http://schemas.microsoft.com/office/word/2010/wordprocessingShape" mc:Ignorable="w14 w15 w16se w16cid w16 w16cex w16sdtdh wp14">
+<w:endnotes xmlns:wpc="http://schemas.microsoft.com/office/word/2010/wordprocessingCanvas" xmlns:cx="http://schemas.microsoft.com/office/drawing/2014/chartex" xmlns:cx1="http://schemas.microsoft.com/office/drawing/2015/9/8/chartex" xmlns:cx2="http://schemas.microsoft.com/office/drawing/2015/10/21/chartex" xmlns:cx3="http://schemas.microsoft.com/office/drawing/2016/5/9/chartex" xmlns:cx4="http://schemas.microsoft.com/office/drawing/2016/5/10/chartex" xmlns:cx5="http://schemas.microsoft.com/office/drawing/2016/5/11/chartex" xmlns:cx6="http://schemas.microsoft.com/office/drawing/2016/5/12/chartex" xmlns:cx7="http://schemas.microsoft.com/office/drawing/2016/5/13/chartex" xmlns:cx8="http://schemas.microsoft.com/office/drawing/2016/5/14/chartex" xmlns:mc="http://schemas.openxmlformats.org/markup-compatibility/2006" xmlns:aink="http://schemas.microsoft.com/office/drawing/2016/ink" xmlns:am3d="http://schemas.microsoft.com/office/drawing/2017/model3d" xmlns:o="urn:schemas-microsoft-com:office:office" xmlns:oel="http://schemas.microsoft.com/office/2019/extlst" xmlns:r="http://schemas.openxmlformats.org/officeDocument/2006/relationships" xmlns:m="http://schemas.openxmlformats.org/officeDocument/2006/math" xmlns:v="urn:schemas-microsoft-com:vml" xmlns:wp14="http://schemas.microsoft.com/office/word/2010/wordprocessingDrawing" xmlns:wp="http://schemas.openxmlformats.org/drawingml/2006/wordprocessingDrawing" xmlns:w10="urn:schemas-microsoft-com:office:word" xmlns:w="http://schemas.openxmlformats.org/wordprocessingml/2006/main" xmlns:w14="http://schemas.microsoft.com/office/word/2010/wordml" xmlns:w15="http://schemas.microsoft.com/office/word/2012/wordml" xmlns:w16cex="http://schemas.microsoft.com/office/word/2018/wordml/cex" xmlns:w16cid="http://schemas.microsoft.com/office/word/2016/wordml/cid" xmlns:w16="http://schemas.microsoft.com/office/word/2018/wordml" xmlns:w16du="http://schemas.microsoft.com/office/word/2023/wordml/word16du" xmlns:w16sdtdh="http://schemas.microsoft.com/office/word/2020/wordml/sdtdatahash" xmlns:w16sdtfl="http://schemas.microsoft.com/office/word/2024/wordml/sdtformatlock" xmlns:w16se="http://schemas.microsoft.com/office/word/2015/wordml/symex" xmlns:wpg="http://schemas.microsoft.com/office/word/2010/wordprocessingGroup" xmlns:wpi="http://schemas.microsoft.com/office/word/2010/wordprocessingInk" xmlns:wne="http://schemas.microsoft.com/office/word/2006/wordml" xmlns:wps="http://schemas.microsoft.com/office/word/2010/wordprocessingShape" mc:Ignorable="w14 w15 w16se w16cid w16 w16cex w16sdtdh w16sdtfl w16du wp14">
   <w:endnote w:type="separator" w:id="-1">
     <w:p>
       <w:pPr>
@@ -504,7 +334,7 @@
 </file>
 
 <file path=word/footnotes.xml><?xml version="1.0" encoding="utf-8"?>
-<w:footnotes xmlns:wpc="http://schemas.microsoft.com/office/word/2010/wordprocessingCanvas" xmlns:cx="http://schemas.microsoft.com/office/drawing/2014/chartex" xmlns:cx1="http://schemas.microsoft.com/office/drawing/2015/9/8/chartex" xmlns:cx2="http://schemas.microsoft.com/office/drawing/2015/10/21/chartex" xmlns:cx3="http://schemas.microsoft.com/office/drawing/2016/5/9/chartex" xmlns:cx4="http://schemas.microsoft.com/office/drawing/2016/5/10/chartex" xmlns:cx5="http://schemas.microsoft.com/office/drawing/2016/5/11/chartex" xmlns:cx6="http://schemas.microsoft.com/office/drawing/2016/5/12/chartex" xmlns:cx7="http://schemas.microsoft.com/office/drawing/2016/5/13/chartex" xmlns:cx8="http://schemas.microsoft.com/office/drawing/2016/5/14/chartex" xmlns:mc="http://schemas.openxmlformats.org/markup-compatibility/2006" xmlns:aink="http://schemas.microsoft.com/office/drawing/2016/ink" xmlns:am3d="http://schemas.microsoft.com/office/drawing/2017/model3d" xmlns:o="urn:schemas-microsoft-com:office:office" xmlns:oel="http://schemas.microsoft.com/office/2019/extlst" xmlns:r="http://schemas.openxmlformats.org/officeDocument/2006/relationships" xmlns:m="http://schemas.openxmlformats.org/officeDocument/2006/math" xmlns:v="urn:schemas-microsoft-com:vml" xmlns:wp14="http://schemas.microsoft.com/office/word/2010/wordprocessingDrawing" xmlns:wp="http://schemas.openxmlformats.org/drawingml/2006/wordprocessingDrawing" xmlns:w10="urn:schemas-microsoft-com:office:word" xmlns:w="http://schemas.openxmlformats.org/wordprocessingml/2006/main" xmlns:w14="http://schemas.microsoft.com/office/word/2010/wordml" xmlns:w15="http://schemas.microsoft.com/office/word/2012/wordml" xmlns:w16cex="http://schemas.microsoft.com/office/word/2018/wordml/cex" xmlns:w16cid="http://schemas.microsoft.com/office/word/2016/wordml/cid" xmlns:w16="http://schemas.microsoft.com/office/word/2018/wordml" xmlns:w16sdtdh="http://schemas.microsoft.com/office/word/2020/wordml/sdtdatahash" xmlns:w16se="http://schemas.microsoft.com/office/word/2015/wordml/symex" xmlns:wpg="http://schemas.microsoft.com/office/word/2010/wordprocessingGroup" xmlns:wpi="http://schemas.microsoft.com/office/word/2010/wordprocessingInk" xmlns:wne="http://schemas.microsoft.com/office/word/2006/wordml" xmlns:wps="http://schemas.microsoft.com/office/word/2010/wordprocessingShape" mc:Ignorable="w14 w15 w16se w16cid w16 w16cex w16sdtdh wp14">
+<w:footnotes xmlns:wpc="http://schemas.microsoft.com/office/word/2010/wordprocessingCanvas" xmlns:cx="http://schemas.microsoft.com/office/drawing/2014/chartex" xmlns:cx1="http://schemas.microsoft.com/office/drawing/2015/9/8/chartex" xmlns:cx2="http://schemas.microsoft.com/office/drawing/2015/10/21/chartex" xmlns:cx3="http://schemas.microsoft.com/office/drawing/2016/5/9/chartex" xmlns:cx4="http://schemas.microsoft.com/office/drawing/2016/5/10/chartex" xmlns:cx5="http://schemas.microsoft.com/office/drawing/2016/5/11/chartex" xmlns:cx6="http://schemas.microsoft.com/office/drawing/2016/5/12/chartex" xmlns:cx7="http://schemas.microsoft.com/office/drawing/2016/5/13/chartex" xmlns:cx8="http://schemas.microsoft.com/office/drawing/2016/5/14/chartex" xmlns:mc="http://schemas.openxmlformats.org/markup-compatibility/2006" xmlns:aink="http://schemas.microsoft.com/office/drawing/2016/ink" xmlns:am3d="http://schemas.microsoft.com/office/drawing/2017/model3d" xmlns:o="urn:schemas-microsoft-com:office:office" xmlns:oel="http://schemas.microsoft.com/office/2019/extlst" xmlns:r="http://schemas.openxmlformats.org/officeDocument/2006/relationships" xmlns:m="http://schemas.openxmlformats.org/officeDocument/2006/math" xmlns:v="urn:schemas-microsoft-com:vml" xmlns:wp14="http://schemas.microsoft.com/office/word/2010/wordprocessingDrawing" xmlns:wp="http://schemas.openxmlformats.org/drawingml/2006/wordprocessingDrawing" xmlns:w10="urn:schemas-microsoft-com:office:word" xmlns:w="http://schemas.openxmlformats.org/wordprocessingml/2006/main" xmlns:w14="http://schemas.microsoft.com/office/word/2010/wordml" xmlns:w15="http://schemas.microsoft.com/office/word/2012/wordml" xmlns:w16cex="http://schemas.microsoft.com/office/word/2018/wordml/cex" xmlns:w16cid="http://schemas.microsoft.com/office/word/2016/wordml/cid" xmlns:w16="http://schemas.microsoft.com/office/word/2018/wordml" xmlns:w16du="http://schemas.microsoft.com/office/word/2023/wordml/word16du" xmlns:w16sdtdh="http://schemas.microsoft.com/office/word/2020/wordml/sdtdatahash" xmlns:w16sdtfl="http://schemas.microsoft.com/office/word/2024/wordml/sdtformatlock" xmlns:w16se="http://schemas.microsoft.com/office/word/2015/wordml/symex" xmlns:wpg="http://schemas.microsoft.com/office/word/2010/wordprocessingGroup" xmlns:wpi="http://schemas.microsoft.com/office/word/2010/wordprocessingInk" xmlns:wne="http://schemas.microsoft.com/office/word/2006/wordml" xmlns:wps="http://schemas.microsoft.com/office/word/2010/wordprocessingShape" mc:Ignorable="w14 w15 w16se w16cid w16 w16cex w16sdtdh w16sdtfl w16du wp14">
   <w:footnote w:type="separator" w:id="-1">
     <w:p>
       <w:pPr>
@@ -529,7 +359,7 @@
 </file>
 
 <file path=word/numbering.xml><?xml version="1.0" encoding="utf-8"?>
-<w:numbering xmlns:wpc="http://schemas.microsoft.com/office/word/2010/wordprocessingCanvas" xmlns:cx="http://schemas.microsoft.com/office/drawing/2014/chartex" xmlns:cx1="http://schemas.microsoft.com/office/drawing/2015/9/8/chartex" xmlns:cx2="http://schemas.microsoft.com/office/drawing/2015/10/21/chartex" xmlns:cx3="http://schemas.microsoft.com/office/drawing/2016/5/9/chartex" xmlns:cx4="http://schemas.microsoft.com/office/drawing/2016/5/10/chartex" xmlns:cx5="http://schemas.microsoft.com/office/drawing/2016/5/11/chartex" xmlns:cx6="http://schemas.microsoft.com/office/drawing/2016/5/12/chartex" xmlns:cx7="http://schemas.microsoft.com/office/drawing/2016/5/13/chartex" xmlns:cx8="http://schemas.microsoft.com/office/drawing/2016/5/14/chartex" xmlns:mc="http://schemas.openxmlformats.org/markup-compatibility/2006" xmlns:aink="http://schemas.microsoft.com/office/drawing/2016/ink" xmlns:am3d="http://schemas.microsoft.com/office/drawing/2017/model3d" xmlns:o="urn:schemas-microsoft-com:office:office" xmlns:oel="http://schemas.microsoft.com/office/2019/extlst" xmlns:r="http://schemas.openxmlformats.org/officeDocument/2006/relationships" xmlns:m="http://schemas.openxmlformats.org/officeDocument/2006/math" xmlns:v="urn:schemas-microsoft-com:vml" xmlns:wp14="http://schemas.microsoft.com/office/word/2010/wordprocessingDrawing" xmlns:wp="http://schemas.openxmlformats.org/drawingml/2006/wordprocessingDrawing" xmlns:w10="urn:schemas-microsoft-com:office:word" xmlns:w="http://schemas.openxmlformats.org/wordprocessingml/2006/main" xmlns:w14="http://schemas.microsoft.com/office/word/2010/wordml" xmlns:w15="http://schemas.microsoft.com/office/word/2012/wordml" xmlns:w16cex="http://schemas.microsoft.com/office/word/2018/wordml/cex" xmlns:w16cid="http://schemas.microsoft.com/office/word/2016/wordml/cid" xmlns:w16="http://schemas.microsoft.com/office/word/2018/wordml" xmlns:w16sdtdh="http://schemas.microsoft.com/office/word/2020/wordml/sdtdatahash" xmlns:w16se="http://schemas.microsoft.com/office/word/2015/wordml/symex" xmlns:wpg="http://schemas.microsoft.com/office/word/2010/wordprocessingGroup" xmlns:wpi="http://schemas.microsoft.com/office/word/2010/wordprocessingInk" xmlns:wne="http://schemas.microsoft.com/office/word/2006/wordml" xmlns:wps="http://schemas.microsoft.com/office/word/2010/wordprocessingShape" mc:Ignorable="w14 w15 w16se w16cid w16 w16cex w16sdtdh wp14">
+<w:numbering xmlns:wpc="http://schemas.microsoft.com/office/word/2010/wordprocessingCanvas" xmlns:cx="http://schemas.microsoft.com/office/drawing/2014/chartex" xmlns:cx1="http://schemas.microsoft.com/office/drawing/2015/9/8/chartex" xmlns:cx2="http://schemas.microsoft.com/office/drawing/2015/10/21/chartex" xmlns:cx3="http://schemas.microsoft.com/office/drawing/2016/5/9/chartex" xmlns:cx4="http://schemas.microsoft.com/office/drawing/2016/5/10/chartex" xmlns:cx5="http://schemas.microsoft.com/office/drawing/2016/5/11/chartex" xmlns:cx6="http://schemas.microsoft.com/office/drawing/2016/5/12/chartex" xmlns:cx7="http://schemas.microsoft.com/office/drawing/2016/5/13/chartex" xmlns:cx8="http://schemas.microsoft.com/office/drawing/2016/5/14/chartex" xmlns:mc="http://schemas.openxmlformats.org/markup-compatibility/2006" xmlns:aink="http://schemas.microsoft.com/office/drawing/2016/ink" xmlns:am3d="http://schemas.microsoft.com/office/drawing/2017/model3d" xmlns:o="urn:schemas-microsoft-com:office:office" xmlns:oel="http://schemas.microsoft.com/office/2019/extlst" xmlns:r="http://schemas.openxmlformats.org/officeDocument/2006/relationships" xmlns:m="http://schemas.openxmlformats.org/officeDocument/2006/math" xmlns:v="urn:schemas-microsoft-com:vml" xmlns:wp14="http://schemas.microsoft.com/office/word/2010/wordprocessingDrawing" xmlns:wp="http://schemas.openxmlformats.org/drawingml/2006/wordprocessingDrawing" xmlns:w10="urn:schemas-microsoft-com:office:word" xmlns:w="http://schemas.openxmlformats.org/wordprocessingml/2006/main" xmlns:w14="http://schemas.microsoft.com/office/word/2010/wordml" xmlns:w15="http://schemas.microsoft.com/office/word/2012/wordml" xmlns:w16cex="http://schemas.microsoft.com/office/word/2018/wordml/cex" xmlns:w16cid="http://schemas.microsoft.com/office/word/2016/wordml/cid" xmlns:w16="http://schemas.microsoft.com/office/word/2018/wordml" xmlns:w16du="http://schemas.microsoft.com/office/word/2023/wordml/word16du" xmlns:w16sdtdh="http://schemas.microsoft.com/office/word/2020/wordml/sdtdatahash" xmlns:w16sdtfl="http://schemas.microsoft.com/office/word/2024/wordml/sdtformatlock" xmlns:w16se="http://schemas.microsoft.com/office/word/2015/wordml/symex" xmlns:wpg="http://schemas.microsoft.com/office/word/2010/wordprocessingGroup" xmlns:wpi="http://schemas.microsoft.com/office/word/2010/wordprocessingInk" xmlns:wne="http://schemas.microsoft.com/office/word/2006/wordml" xmlns:wps="http://schemas.microsoft.com/office/word/2010/wordprocessingShape" mc:Ignorable="w14 w15 w16se w16cid w16 w16cex w16sdtdh w16sdtfl w16du wp14">
   <w:abstractNum w:abstractNumId="0" w15:restartNumberingAfterBreak="0">
     <w:nsid w:val="FFFFFF7C"/>
     <w:multiLevelType w:val="singleLevel"/>
@@ -732,7 +562,7 @@
 </file>
 
 <file path=word/styles.xml><?xml version="1.0" encoding="utf-8"?>
-<w:styles xmlns:mc="http://schemas.openxmlformats.org/markup-compatibility/2006" xmlns:r="http://schemas.openxmlformats.org/officeDocument/2006/relationships" xmlns:w="http://schemas.openxmlformats.org/wordprocessingml/2006/main" xmlns:w14="http://schemas.microsoft.com/office/word/2010/wordml" xmlns:w15="http://schemas.microsoft.com/office/word/2012/wordml" xmlns:w16cex="http://schemas.microsoft.com/office/word/2018/wordml/cex" xmlns:w16cid="http://schemas.microsoft.com/office/word/2016/wordml/cid" xmlns:w16="http://schemas.microsoft.com/office/word/2018/wordml" xmlns:w16sdtdh="http://schemas.microsoft.com/office/word/2020/wordml/sdtdatahash" xmlns:w16se="http://schemas.microsoft.com/office/word/2015/wordml/symex" mc:Ignorable="w14 w15 w16se w16cid w16 w16cex w16sdtdh">
+<w:styles xmlns:mc="http://schemas.openxmlformats.org/markup-compatibility/2006" xmlns:r="http://schemas.openxmlformats.org/officeDocument/2006/relationships" xmlns:w="http://schemas.openxmlformats.org/wordprocessingml/2006/main" xmlns:w14="http://schemas.microsoft.com/office/word/2010/wordml" xmlns:w15="http://schemas.microsoft.com/office/word/2012/wordml" xmlns:w16cex="http://schemas.microsoft.com/office/word/2018/wordml/cex" xmlns:w16cid="http://schemas.microsoft.com/office/word/2016/wordml/cid" xmlns:w16="http://schemas.microsoft.com/office/word/2018/wordml" xmlns:w16du="http://schemas.microsoft.com/office/word/2023/wordml/word16du" xmlns:w16sdtdh="http://schemas.microsoft.com/office/word/2020/wordml/sdtdatahash" xmlns:w16sdtfl="http://schemas.microsoft.com/office/word/2024/wordml/sdtformatlock" xmlns:w16se="http://schemas.microsoft.com/office/word/2015/wordml/symex" mc:Ignorable="w14 w15 w16se w16cid w16 w16cex w16sdtdh w16sdtfl w16du">
   <w:docDefaults>
     <w:rPrDefault>
       <w:rPr>

</xml_diff>